<commit_message>
w_9_10_11_12 done for Mar
</commit_message>
<xml_diff>
--- a/chuyenDe/RW/docx/raw47/Reading/Level1/W5.docx
+++ b/chuyenDe/RW/docx/raw47/Reading/Level1/W5.docx
@@ -5452,6 +5452,25 @@
       <w:i/>
     </w:rPr>
   </w:style>
+  <w:style w:styleId="CDListeningSection" w:type="paragraph">
+    <w:name w:val="CD Listening Section"/>
+    <w:basedOn w:val="Normal"/>
+    <w:qFormat/>
+    <w:pPr>
+      <w:spacing w:after="120" w:before="100"/>
+      <w:pBdr>
+        <w:top w:color="1F4E79" w:space="3" w:sz="12" w:val="single"/>
+        <w:left w:color="1F4E79" w:space="3" w:sz="12" w:val="single"/>
+        <w:bottom w:color="1F4E79" w:space="3" w:sz="12" w:val="single"/>
+        <w:right w:color="1F4E79" w:space="3" w:sz="12" w:val="single"/>
+      </w:pBdr>
+      <w:shd w:color="auto" w:fill="EBF3FA" w:val="clear"/>
+      <w:ind w:left="240" w:right="240"/>
+    </w:pPr>
+    <w:rPr>
+      <w:rFonts w:ascii="Georgia" w:cs="Georgia" w:hAnsi="Georgia"/>
+    </w:rPr>
+  </w:style>
   <w:style w:styleId="CDSection" w:type="paragraph">
     <w:name w:val="CD Section"/>
     <w:basedOn w:val="Normal"/>
@@ -5476,7 +5495,7 @@
     <w:basedOn w:val="Normal"/>
     <w:qFormat/>
     <w:pPr>
-      <w:spacing w:after="60" w:before="80"/>
+      <w:spacing w:after="80" w:before="120"/>
       <w:pBdr>
         <w:left w:color="1F4E79" w:space="2" w:sz="24" w:val="single"/>
       </w:pBdr>
@@ -5742,6 +5761,105 @@
         <w:color w:val="FFFFFF"/>
       </w:rPr>
     </w:tblStylePr>
+  </w:style>
+  <w:style w:styleId="CDTranscriptTable" w:type="table">
+    <w:name w:val="CDTranscriptTable"/>
+    <w:basedOn w:val="TableNormal"/>
+    <w:tblPr>
+      <w:tblW w:type="pct" w:w="5000"/>
+      <w:tblInd w:type="dxa" w:w="240"/>
+      <w:tblLayout w:type="fixed"/>
+      <w:tblBorders>
+        <w:top w:color="BFBFBF" w:space="0" w:sz="10" w:val="single"/>
+        <w:left w:color="BFBFBF" w:space="0" w:sz="10" w:val="single"/>
+        <w:bottom w:color="BFBFBF" w:space="0" w:sz="10" w:val="single"/>
+        <w:right w:color="BFBFBF" w:space="0" w:sz="10" w:val="single"/>
+        <w:insideH w:color="D0D0D0" w:space="0" w:sz="8" w:val="single"/>
+        <w:insideV w:color="D0D0D0" w:space="0" w:sz="8" w:val="single"/>
+      </w:tblBorders>
+      <w:tblCellMar>
+        <w:top w:type="dxa" w:w="80"/>
+        <w:left w:type="dxa" w:w="120"/>
+        <w:bottom w:type="dxa" w:w="80"/>
+        <w:right w:type="dxa" w:w="120"/>
+      </w:tblCellMar>
+    </w:tblPr>
+    <w:tblStylePr w:type="firstRow">
+      <w:tcPr>
+        <w:shd w:color="auto" w:fill="1F4E79" w:val="clear"/>
+      </w:tcPr>
+      <w:rPr>
+        <w:rFonts w:ascii="Latin Modern Sans" w:cs="Latin Modern Sans" w:hAnsi="Latin Modern Sans"/>
+        <w:b/>
+        <w:color w:val="FFFFFF"/>
+      </w:rPr>
+    </w:tblStylePr>
+    <w:tblStylePr w:type="band1Horz">
+      <w:tcPr>
+        <w:shd w:color="auto" w:fill="F5F5F5" w:val="clear"/>
+      </w:tcPr>
+    </w:tblStylePr>
+  </w:style>
+  <w:style w:styleId="CDListeningSectionContainer" w:type="table">
+    <w:name w:val="CDListeningSectionContainer"/>
+    <w:basedOn w:val="TableNormal"/>
+    <w:tblPr>
+      <w:tblW w:type="pct" w:w="5000"/>
+      <w:tblLayout w:type="autofit"/>
+      <w:tblBorders>
+        <w:top w:color="E52B20" w:shadow="1" w:space="0" w:sz="12" w:val="single"/>
+        <w:left w:color="E52B20" w:shadow="1" w:space="0" w:sz="12" w:val="single"/>
+        <w:bottom w:color="E52B20" w:shadow="1" w:space="0" w:sz="16" w:val="double"/>
+        <w:right w:color="E52B20" w:shadow="1" w:space="0" w:sz="12" w:val="single"/>
+      </w:tblBorders>
+      <w:shd w:color="auto" w:fill="D6E9F8" w:val="clear"/>
+      <w:tblCellMar>
+        <w:top w:type="dxa" w:w="280"/>
+        <w:left w:type="dxa" w:w="280"/>
+        <w:bottom w:type="dxa" w:w="280"/>
+        <w:right w:type="dxa" w:w="280"/>
+      </w:tblCellMar>
+    </w:tblPr>
+  </w:style>
+  <w:style w:styleId="CDListeningSectionHeader" w:type="paragraph">
+    <w:name w:val="CD Listening Section Header"/>
+    <w:basedOn w:val="Heading1"/>
+    <w:qFormat/>
+    <w:pPr>
+      <w:spacing w:after="120" w:before="240"/>
+      <w:jc w:val="center"/>
+    </w:pPr>
+    <w:rPr>
+      <w:rFonts w:ascii="Latin Modern Sans" w:cs="Latin Modern Sans" w:hAnsi="Latin Modern Sans"/>
+      <w:b/>
+      <w:color w:val="1F4E79"/>
+      <w:sz w:val="28"/>
+    </w:rPr>
+  </w:style>
+  <w:style w:styleId="CDTranscriptSection" w:type="paragraph">
+    <w:name w:val="CD Transcript Section"/>
+    <w:basedOn w:val="Normal"/>
+    <w:qFormat/>
+    <w:pPr>
+      <w:spacing w:after="80" w:before="160"/>
+    </w:pPr>
+    <w:rPr>
+      <w:rFonts w:ascii="Latin Modern Sans" w:cs="Latin Modern Sans" w:hAnsi="Latin Modern Sans"/>
+      <w:color w:val="1F4E79"/>
+      <w:sz w:val="24"/>
+    </w:rPr>
+  </w:style>
+  <w:style w:styleId="CDTranscriptContent" w:type="paragraph">
+    <w:name w:val="CD Transcript Content"/>
+    <w:basedOn w:val="Normal"/>
+    <w:qFormat/>
+    <w:pPr>
+      <w:spacing w:after="120" w:before="0"/>
+    </w:pPr>
+    <w:rPr>
+      <w:rFonts w:ascii="Georgia" w:cs="Georgia" w:hAnsi="Georgia"/>
+      <w:sz w:val="24"/>
+    </w:rPr>
   </w:style>
   <w:style w:type="paragraph" w:customStyle="1" w:styleId="SourceCode">
     <w:name w:val="Source Code"/>

</xml_diff>